<commit_message>
Update document : Story_查询计划展示优化.docx
git-svn-id: http://192.168.20.11/sequoiadb/trunk@31803 6121f079-4a18-41d3-8c30-8870a322f2c2
</commit_message>
<xml_diff>
--- a/internal_doc/03.开发设计/性能/Story_查询计划展示优化.docx
+++ b/internal_doc/03.开发设计/性能/Story_查询计划展示优化.docx
@@ -409,6 +409,20 @@
           <w:rFonts w:hint="eastAsia"/>
         </w:rPr>
         <w:t>接口描述</w:t>
+      </w:r>
+    </w:p>
+    <w:p>
+      <w:r>
+        <w:rPr>
+          <w:rFonts w:hint="eastAsia"/>
+        </w:rPr>
+        <w:t>sdbshell</w:t>
+      </w:r>
+      <w:r>
+        <w:rPr>
+          <w:rFonts w:hint="eastAsia"/>
+        </w:rPr>
+        <w:t>添加一下接口</w:t>
       </w:r>
     </w:p>
     <w:p>
@@ -469,6 +483,7 @@
         <w:rPr>
           <w:rFonts w:hint="eastAsia"/>
         </w:rPr>
+        <w:lastRenderedPageBreak/>
         <w:t>语法</w:t>
       </w:r>
     </w:p>
@@ -521,7 +536,6 @@
         <w:rPr>
           <w:rFonts w:hint="eastAsia"/>
         </w:rPr>
-        <w:lastRenderedPageBreak/>
         <w:t>输出</w:t>
       </w:r>
     </w:p>
@@ -1298,10 +1312,11 @@
             </w:pPr>
             <w:r>
               <w:rPr>
-                <w:sz w:val="13"/>
-                <w:szCs w:val="13"/>
-              </w:rPr>
-              <w:t>Selector</w:t>
+                <w:rFonts w:hint="eastAsia"/>
+                <w:sz w:val="13"/>
+                <w:szCs w:val="13"/>
+              </w:rPr>
+              <w:t>OrderBy</w:t>
             </w:r>
           </w:p>
         </w:tc>
@@ -1353,7 +1368,7 @@
                 <w:sz w:val="13"/>
                 <w:szCs w:val="13"/>
               </w:rPr>
-              <w:t>查询计划中的选择符</w:t>
+              <w:t>查询计划中的排序字段</w:t>
             </w:r>
           </w:p>
         </w:tc>
@@ -1377,7 +1392,7 @@
                 <w:sz w:val="13"/>
                 <w:szCs w:val="13"/>
               </w:rPr>
-              <w:t>OrderBy</w:t>
+              <w:t>Hint</w:t>
             </w:r>
           </w:p>
         </w:tc>
@@ -1429,82 +1444,6 @@
                 <w:sz w:val="13"/>
                 <w:szCs w:val="13"/>
               </w:rPr>
-              <w:t>查询计划中的排序字段</w:t>
-            </w:r>
-          </w:p>
-        </w:tc>
-      </w:tr>
-      <w:tr>
-        <w:tc>
-          <w:tcPr>
-            <w:tcW w:w="0" w:type="auto"/>
-          </w:tcPr>
-          <w:p>
-            <w:pPr>
-              <w:ind w:left="0"/>
-              <w:rPr>
-                <w:sz w:val="13"/>
-                <w:szCs w:val="13"/>
-              </w:rPr>
-            </w:pPr>
-            <w:r>
-              <w:rPr>
-                <w:rFonts w:hint="eastAsia"/>
-                <w:sz w:val="13"/>
-                <w:szCs w:val="13"/>
-              </w:rPr>
-              <w:t>Hint</w:t>
-            </w:r>
-          </w:p>
-        </w:tc>
-        <w:tc>
-          <w:tcPr>
-            <w:tcW w:w="0" w:type="auto"/>
-          </w:tcPr>
-          <w:p>
-            <w:pPr>
-              <w:ind w:left="0"/>
-              <w:rPr>
-                <w:sz w:val="13"/>
-                <w:szCs w:val="13"/>
-              </w:rPr>
-            </w:pPr>
-            <w:r>
-              <w:rPr>
-                <w:rFonts w:hint="eastAsia"/>
-                <w:sz w:val="13"/>
-                <w:szCs w:val="13"/>
-              </w:rPr>
-              <w:t>BSON</w:t>
-            </w:r>
-            <w:r>
-              <w:rPr>
-                <w:rFonts w:hint="eastAsia"/>
-                <w:sz w:val="13"/>
-                <w:szCs w:val="13"/>
-              </w:rPr>
-              <w:t>对象</w:t>
-            </w:r>
-          </w:p>
-        </w:tc>
-        <w:tc>
-          <w:tcPr>
-            <w:tcW w:w="0" w:type="auto"/>
-          </w:tcPr>
-          <w:p>
-            <w:pPr>
-              <w:ind w:left="0"/>
-              <w:rPr>
-                <w:sz w:val="13"/>
-                <w:szCs w:val="13"/>
-              </w:rPr>
-            </w:pPr>
-            <w:r>
-              <w:rPr>
-                <w:rFonts w:hint="eastAsia"/>
-                <w:sz w:val="13"/>
-                <w:szCs w:val="13"/>
-              </w:rPr>
               <w:t>查询计划中指定</w:t>
             </w:r>
             <w:r>
@@ -1514,190 +1453,6 @@
                 <w:szCs w:val="13"/>
               </w:rPr>
               <w:t>查询使用索引的情况</w:t>
-            </w:r>
-          </w:p>
-        </w:tc>
-      </w:tr>
-      <w:tr>
-        <w:tc>
-          <w:tcPr>
-            <w:tcW w:w="0" w:type="auto"/>
-          </w:tcPr>
-          <w:p>
-            <w:pPr>
-              <w:ind w:left="0"/>
-              <w:rPr>
-                <w:sz w:val="13"/>
-                <w:szCs w:val="13"/>
-              </w:rPr>
-            </w:pPr>
-            <w:r>
-              <w:rPr>
-                <w:rFonts w:hint="eastAsia"/>
-                <w:sz w:val="13"/>
-                <w:szCs w:val="13"/>
-              </w:rPr>
-              <w:t>Skip</w:t>
-            </w:r>
-          </w:p>
-        </w:tc>
-        <w:tc>
-          <w:tcPr>
-            <w:tcW w:w="0" w:type="auto"/>
-          </w:tcPr>
-          <w:p>
-            <w:pPr>
-              <w:ind w:left="0"/>
-              <w:rPr>
-                <w:sz w:val="13"/>
-                <w:szCs w:val="13"/>
-              </w:rPr>
-            </w:pPr>
-            <w:r>
-              <w:rPr>
-                <w:rFonts w:hint="eastAsia"/>
-                <w:sz w:val="13"/>
-                <w:szCs w:val="13"/>
-              </w:rPr>
-              <w:t>整型</w:t>
-            </w:r>
-          </w:p>
-        </w:tc>
-        <w:tc>
-          <w:tcPr>
-            <w:tcW w:w="0" w:type="auto"/>
-          </w:tcPr>
-          <w:p>
-            <w:pPr>
-              <w:ind w:left="0"/>
-              <w:rPr>
-                <w:sz w:val="13"/>
-                <w:szCs w:val="13"/>
-              </w:rPr>
-            </w:pPr>
-            <w:r>
-              <w:rPr>
-                <w:rFonts w:hint="eastAsia"/>
-                <w:sz w:val="13"/>
-                <w:szCs w:val="13"/>
-              </w:rPr>
-              <w:t>查询计划中指定</w:t>
-            </w:r>
-            <w:r>
-              <w:rPr>
-                <w:rFonts w:hint="eastAsia"/>
-                <w:sz w:val="13"/>
-                <w:szCs w:val="13"/>
-              </w:rPr>
-              <w:t>从结果集哪条记录开始返回，</w:t>
-            </w:r>
-            <w:r>
-              <w:rPr>
-                <w:rFonts w:hint="eastAsia"/>
-                <w:sz w:val="13"/>
-                <w:szCs w:val="13"/>
-              </w:rPr>
-              <w:t>默认值为</w:t>
-            </w:r>
-            <w:r>
-              <w:rPr>
-                <w:rFonts w:hint="eastAsia"/>
-                <w:sz w:val="13"/>
-                <w:szCs w:val="13"/>
-              </w:rPr>
-              <w:t>0</w:t>
-            </w:r>
-          </w:p>
-        </w:tc>
-      </w:tr>
-      <w:tr>
-        <w:tc>
-          <w:tcPr>
-            <w:tcW w:w="0" w:type="auto"/>
-          </w:tcPr>
-          <w:p>
-            <w:pPr>
-              <w:ind w:left="0"/>
-              <w:rPr>
-                <w:sz w:val="13"/>
-                <w:szCs w:val="13"/>
-              </w:rPr>
-            </w:pPr>
-            <w:r>
-              <w:rPr>
-                <w:rFonts w:hint="eastAsia"/>
-                <w:sz w:val="13"/>
-                <w:szCs w:val="13"/>
-              </w:rPr>
-              <w:t>Limit</w:t>
-            </w:r>
-          </w:p>
-        </w:tc>
-        <w:tc>
-          <w:tcPr>
-            <w:tcW w:w="0" w:type="auto"/>
-          </w:tcPr>
-          <w:p>
-            <w:pPr>
-              <w:ind w:left="0"/>
-              <w:rPr>
-                <w:sz w:val="13"/>
-                <w:szCs w:val="13"/>
-              </w:rPr>
-            </w:pPr>
-            <w:r>
-              <w:rPr>
-                <w:rFonts w:hint="eastAsia"/>
-                <w:sz w:val="13"/>
-                <w:szCs w:val="13"/>
-              </w:rPr>
-              <w:t>整型</w:t>
-            </w:r>
-          </w:p>
-        </w:tc>
-        <w:tc>
-          <w:tcPr>
-            <w:tcW w:w="0" w:type="auto"/>
-          </w:tcPr>
-          <w:p>
-            <w:pPr>
-              <w:ind w:left="0"/>
-              <w:rPr>
-                <w:sz w:val="13"/>
-                <w:szCs w:val="13"/>
-              </w:rPr>
-            </w:pPr>
-            <w:r>
-              <w:rPr>
-                <w:rFonts w:hint="eastAsia"/>
-                <w:sz w:val="13"/>
-                <w:szCs w:val="13"/>
-              </w:rPr>
-              <w:t>查询计划中指定</w:t>
-            </w:r>
-            <w:r>
-              <w:rPr>
-                <w:rFonts w:hint="eastAsia"/>
-                <w:sz w:val="13"/>
-                <w:szCs w:val="13"/>
-              </w:rPr>
-              <w:t>返回结果集的记录条数</w:t>
-            </w:r>
-            <w:r>
-              <w:rPr>
-                <w:rFonts w:hint="eastAsia"/>
-                <w:sz w:val="13"/>
-                <w:szCs w:val="13"/>
-              </w:rPr>
-              <w:t>，默认值为</w:t>
-            </w:r>
-            <w:r>
-              <w:rPr>
-                <w:rFonts w:hint="eastAsia"/>
-                <w:sz w:val="13"/>
-                <w:szCs w:val="13"/>
-              </w:rPr>
-              <w:t>-1</w:t>
             </w:r>
           </w:p>
         </w:tc>
@@ -2126,6 +1881,7 @@
               <w:ind w:left="0"/>
             </w:pPr>
             <w:r>
+              <w:lastRenderedPageBreak/>
               <w:t xml:space="preserve">        "Collection": {</w:t>
             </w:r>
           </w:p>
@@ -2142,7 +1898,6 @@
               <w:ind w:left="0"/>
             </w:pPr>
             <w:r>
-              <w:lastRenderedPageBreak/>
               <w:t xml:space="preserve">            "$param": 0,</w:t>
             </w:r>
           </w:p>
@@ -2337,9 +2092,6 @@
     <w:p>
       <w:pPr>
         <w:pStyle w:val="Heading4"/>
-        <w:rPr>
-          <w:rFonts w:hint="eastAsia"/>
-        </w:rPr>
       </w:pPr>
       <w:r>
         <w:rPr>
@@ -2349,11 +2101,6 @@
       </w:r>
     </w:p>
     <w:p>
-      <w:pPr>
-        <w:rPr>
-          <w:rFonts w:hint="eastAsia"/>
-        </w:rPr>
-      </w:pPr>
       <w:r>
         <w:rPr>
           <w:rFonts w:hint="eastAsia"/>
@@ -2490,7 +2237,6 @@
         <w:rPr>
           <w:rFonts w:hint="eastAsia"/>
         </w:rPr>
-        <w:lastRenderedPageBreak/>
         <w:t>输出</w:t>
       </w:r>
     </w:p>
@@ -3180,7 +2926,23 @@
                 <w:sz w:val="13"/>
                 <w:szCs w:val="13"/>
               </w:rPr>
-              <w:t>Detail.ParamValid</w:t>
+              <w:t>Detail.Param</w:t>
+            </w:r>
+            <w:r>
+              <w:rPr>
+                <w:rFonts w:hint="eastAsia"/>
+                <w:sz w:val="13"/>
+                <w:szCs w:val="13"/>
+              </w:rPr>
+              <w:t>Plan</w:t>
+            </w:r>
+            <w:r>
+              <w:rPr>
+                <w:rFonts w:hint="eastAsia"/>
+                <w:sz w:val="13"/>
+                <w:szCs w:val="13"/>
+              </w:rPr>
+              <w:t>Valid</w:t>
             </w:r>
           </w:p>
         </w:tc>
@@ -3271,69 +3033,80 @@
             <w:pPr>
               <w:ind w:left="0"/>
               <w:rPr>
-                <w:sz w:val="13"/>
-                <w:szCs w:val="13"/>
-              </w:rPr>
-            </w:pPr>
-            <w:r>
-              <w:rPr>
-                <w:rFonts w:hint="eastAsia"/>
-                <w:sz w:val="13"/>
-                <w:szCs w:val="13"/>
-              </w:rPr>
-              <w:t>Detail.Parameters</w:t>
-            </w:r>
-          </w:p>
-        </w:tc>
-        <w:tc>
-          <w:tcPr>
-            <w:tcW w:w="0" w:type="auto"/>
-          </w:tcPr>
-          <w:p>
-            <w:pPr>
-              <w:ind w:left="0"/>
-              <w:rPr>
-                <w:sz w:val="13"/>
-                <w:szCs w:val="13"/>
-              </w:rPr>
-            </w:pPr>
-            <w:r>
-              <w:rPr>
-                <w:rFonts w:hint="eastAsia"/>
-                <w:sz w:val="13"/>
-                <w:szCs w:val="13"/>
-              </w:rPr>
-              <w:t>数组类型</w:t>
-            </w:r>
-          </w:p>
-        </w:tc>
-        <w:tc>
-          <w:tcPr>
-            <w:tcW w:w="0" w:type="auto"/>
-          </w:tcPr>
-          <w:p>
-            <w:pPr>
-              <w:ind w:left="0"/>
-              <w:rPr>
-                <w:sz w:val="13"/>
-                <w:szCs w:val="13"/>
-              </w:rPr>
-            </w:pPr>
-            <w:r>
-              <w:rPr>
-                <w:rFonts w:hint="eastAsia"/>
-                <w:sz w:val="13"/>
-                <w:szCs w:val="13"/>
-              </w:rPr>
-              <w:t>参数化的查询计划使用的参数</w:t>
-            </w:r>
-            <w:r>
-              <w:rPr>
-                <w:rFonts w:hint="eastAsia"/>
-                <w:sz w:val="13"/>
-                <w:szCs w:val="13"/>
-              </w:rPr>
-              <w:t>列表</w:t>
+                <w:rFonts w:hint="eastAsia"/>
+                <w:sz w:val="13"/>
+                <w:szCs w:val="13"/>
+              </w:rPr>
+            </w:pPr>
+            <w:r>
+              <w:rPr>
+                <w:rFonts w:hint="eastAsia"/>
+                <w:sz w:val="13"/>
+                <w:szCs w:val="13"/>
+              </w:rPr>
+              <w:t>Detail.MainCL</w:t>
+            </w:r>
+            <w:r>
+              <w:rPr>
+                <w:rFonts w:hint="eastAsia"/>
+                <w:sz w:val="13"/>
+                <w:szCs w:val="13"/>
+              </w:rPr>
+              <w:t>Plan</w:t>
+            </w:r>
+            <w:r>
+              <w:rPr>
+                <w:rFonts w:hint="eastAsia"/>
+                <w:sz w:val="13"/>
+                <w:szCs w:val="13"/>
+              </w:rPr>
+              <w:t>Valid</w:t>
+            </w:r>
+          </w:p>
+        </w:tc>
+        <w:tc>
+          <w:tcPr>
+            <w:tcW w:w="0" w:type="auto"/>
+          </w:tcPr>
+          <w:p>
+            <w:pPr>
+              <w:ind w:left="0"/>
+              <w:rPr>
+                <w:rFonts w:hint="eastAsia"/>
+                <w:sz w:val="13"/>
+                <w:szCs w:val="13"/>
+              </w:rPr>
+            </w:pPr>
+            <w:r>
+              <w:rPr>
+                <w:rFonts w:hint="eastAsia"/>
+                <w:sz w:val="13"/>
+                <w:szCs w:val="13"/>
+              </w:rPr>
+              <w:t>布尔型</w:t>
+            </w:r>
+          </w:p>
+        </w:tc>
+        <w:tc>
+          <w:tcPr>
+            <w:tcW w:w="0" w:type="auto"/>
+          </w:tcPr>
+          <w:p>
+            <w:pPr>
+              <w:ind w:left="0"/>
+              <w:rPr>
+                <w:rFonts w:hint="eastAsia"/>
+                <w:sz w:val="13"/>
+                <w:szCs w:val="13"/>
+              </w:rPr>
+            </w:pPr>
+            <w:r>
+              <w:rPr>
+                <w:rFonts w:hint="eastAsia"/>
+                <w:sz w:val="13"/>
+                <w:szCs w:val="13"/>
+              </w:rPr>
+              <w:t>主表共享的查询计划是否已经可以有效使用</w:t>
             </w:r>
           </w:p>
         </w:tc>
@@ -3357,59 +3130,59 @@
                 <w:sz w:val="13"/>
                 <w:szCs w:val="13"/>
               </w:rPr>
-              <w:t>Detail.MatchConfig</w:t>
-            </w:r>
-          </w:p>
-        </w:tc>
-        <w:tc>
-          <w:tcPr>
-            <w:tcW w:w="0" w:type="auto"/>
-          </w:tcPr>
-          <w:p>
-            <w:pPr>
-              <w:ind w:left="0"/>
-              <w:rPr>
-                <w:sz w:val="13"/>
-                <w:szCs w:val="13"/>
-              </w:rPr>
-            </w:pPr>
-            <w:r>
-              <w:rPr>
-                <w:rFonts w:hint="eastAsia"/>
-                <w:sz w:val="13"/>
-                <w:szCs w:val="13"/>
-              </w:rPr>
-              <w:t>BSON</w:t>
-            </w:r>
-            <w:r>
-              <w:rPr>
-                <w:rFonts w:hint="eastAsia"/>
-                <w:sz w:val="13"/>
-                <w:szCs w:val="13"/>
-              </w:rPr>
-              <w:t>对象</w:t>
-            </w:r>
-          </w:p>
-        </w:tc>
-        <w:tc>
-          <w:tcPr>
-            <w:tcW w:w="0" w:type="auto"/>
-          </w:tcPr>
-          <w:p>
-            <w:pPr>
-              <w:ind w:left="0"/>
-              <w:rPr>
-                <w:sz w:val="13"/>
-                <w:szCs w:val="13"/>
-              </w:rPr>
-            </w:pPr>
-            <w:r>
-              <w:rPr>
-                <w:rFonts w:hint="eastAsia"/>
-                <w:sz w:val="13"/>
-                <w:szCs w:val="13"/>
-              </w:rPr>
-              <w:t>查询计划中的匹配符的配置</w:t>
+              <w:t>Detail.Parameters</w:t>
+            </w:r>
+          </w:p>
+        </w:tc>
+        <w:tc>
+          <w:tcPr>
+            <w:tcW w:w="0" w:type="auto"/>
+          </w:tcPr>
+          <w:p>
+            <w:pPr>
+              <w:ind w:left="0"/>
+              <w:rPr>
+                <w:sz w:val="13"/>
+                <w:szCs w:val="13"/>
+              </w:rPr>
+            </w:pPr>
+            <w:r>
+              <w:rPr>
+                <w:rFonts w:hint="eastAsia"/>
+                <w:sz w:val="13"/>
+                <w:szCs w:val="13"/>
+              </w:rPr>
+              <w:t>数组类型</w:t>
+            </w:r>
+          </w:p>
+        </w:tc>
+        <w:tc>
+          <w:tcPr>
+            <w:tcW w:w="0" w:type="auto"/>
+          </w:tcPr>
+          <w:p>
+            <w:pPr>
+              <w:ind w:left="0"/>
+              <w:rPr>
+                <w:sz w:val="13"/>
+                <w:szCs w:val="13"/>
+              </w:rPr>
+            </w:pPr>
+            <w:r>
+              <w:rPr>
+                <w:rFonts w:hint="eastAsia"/>
+                <w:sz w:val="13"/>
+                <w:szCs w:val="13"/>
+              </w:rPr>
+              <w:t>参数化的查询计划使用的参数</w:t>
+            </w:r>
+            <w:r>
+              <w:rPr>
+                <w:rFonts w:hint="eastAsia"/>
+                <w:sz w:val="13"/>
+                <w:szCs w:val="13"/>
+              </w:rPr>
+              <w:t>列表</w:t>
             </w:r>
           </w:p>
         </w:tc>
@@ -3433,51 +3206,59 @@
                 <w:sz w:val="13"/>
                 <w:szCs w:val="13"/>
               </w:rPr>
-              <w:t>Detail.MatchConfig.EnableMixCmp</w:t>
-            </w:r>
-          </w:p>
-        </w:tc>
-        <w:tc>
-          <w:tcPr>
-            <w:tcW w:w="0" w:type="auto"/>
-          </w:tcPr>
-          <w:p>
-            <w:pPr>
-              <w:ind w:left="0"/>
-              <w:rPr>
-                <w:sz w:val="13"/>
-                <w:szCs w:val="13"/>
-              </w:rPr>
-            </w:pPr>
-            <w:r>
-              <w:rPr>
-                <w:rFonts w:hint="eastAsia"/>
-                <w:sz w:val="13"/>
-                <w:szCs w:val="13"/>
-              </w:rPr>
-              <w:t>布尔型</w:t>
-            </w:r>
-          </w:p>
-        </w:tc>
-        <w:tc>
-          <w:tcPr>
-            <w:tcW w:w="0" w:type="auto"/>
-          </w:tcPr>
-          <w:p>
-            <w:pPr>
-              <w:ind w:left="0"/>
-              <w:rPr>
-                <w:sz w:val="13"/>
-                <w:szCs w:val="13"/>
-              </w:rPr>
-            </w:pPr>
-            <w:r>
-              <w:rPr>
-                <w:rFonts w:hint="eastAsia"/>
-                <w:sz w:val="13"/>
-                <w:szCs w:val="13"/>
-              </w:rPr>
-              <w:t>匹配符是否使用混合匹配模式</w:t>
+              <w:t>Detail.MatchConfig</w:t>
+            </w:r>
+          </w:p>
+        </w:tc>
+        <w:tc>
+          <w:tcPr>
+            <w:tcW w:w="0" w:type="auto"/>
+          </w:tcPr>
+          <w:p>
+            <w:pPr>
+              <w:ind w:left="0"/>
+              <w:rPr>
+                <w:sz w:val="13"/>
+                <w:szCs w:val="13"/>
+              </w:rPr>
+            </w:pPr>
+            <w:r>
+              <w:rPr>
+                <w:rFonts w:hint="eastAsia"/>
+                <w:sz w:val="13"/>
+                <w:szCs w:val="13"/>
+              </w:rPr>
+              <w:t>BSON</w:t>
+            </w:r>
+            <w:r>
+              <w:rPr>
+                <w:rFonts w:hint="eastAsia"/>
+                <w:sz w:val="13"/>
+                <w:szCs w:val="13"/>
+              </w:rPr>
+              <w:t>对象</w:t>
+            </w:r>
+          </w:p>
+        </w:tc>
+        <w:tc>
+          <w:tcPr>
+            <w:tcW w:w="0" w:type="auto"/>
+          </w:tcPr>
+          <w:p>
+            <w:pPr>
+              <w:ind w:left="0"/>
+              <w:rPr>
+                <w:sz w:val="13"/>
+                <w:szCs w:val="13"/>
+              </w:rPr>
+            </w:pPr>
+            <w:r>
+              <w:rPr>
+                <w:rFonts w:hint="eastAsia"/>
+                <w:sz w:val="13"/>
+                <w:szCs w:val="13"/>
+              </w:rPr>
+              <w:t>查询计划中的匹配符的配置</w:t>
             </w:r>
           </w:p>
         </w:tc>
@@ -3501,7 +3282,7 @@
                 <w:sz w:val="13"/>
                 <w:szCs w:val="13"/>
               </w:rPr>
-              <w:t>Detail.MatchConfig.Parameterized</w:t>
+              <w:t>Detail.MatchConfig.EnableMixCmp</w:t>
             </w:r>
           </w:p>
         </w:tc>
@@ -3545,7 +3326,7 @@
                 <w:sz w:val="13"/>
                 <w:szCs w:val="13"/>
               </w:rPr>
-              <w:t>匹配符是否支持参数化</w:t>
+              <w:t>匹配符是否使用混合匹配模式</w:t>
             </w:r>
           </w:p>
         </w:tc>
@@ -3569,7 +3350,7 @@
                 <w:sz w:val="13"/>
                 <w:szCs w:val="13"/>
               </w:rPr>
-              <w:t>Detail.MatchConfig.FuzzyOptr</w:t>
+              <w:t>Detail.MatchConfig.Parameterized</w:t>
             </w:r>
           </w:p>
         </w:tc>
@@ -3613,7 +3394,7 @@
                 <w:sz w:val="13"/>
                 <w:szCs w:val="13"/>
               </w:rPr>
-              <w:t>匹配符是否支持模糊匹配</w:t>
+              <w:t>匹配符是否支持参数化</w:t>
             </w:r>
           </w:p>
         </w:tc>
@@ -3637,6 +3418,74 @@
                 <w:sz w:val="13"/>
                 <w:szCs w:val="13"/>
               </w:rPr>
+              <w:t>Detail.MatchConfig.FuzzyOptr</w:t>
+            </w:r>
+          </w:p>
+        </w:tc>
+        <w:tc>
+          <w:tcPr>
+            <w:tcW w:w="0" w:type="auto"/>
+          </w:tcPr>
+          <w:p>
+            <w:pPr>
+              <w:ind w:left="0"/>
+              <w:rPr>
+                <w:sz w:val="13"/>
+                <w:szCs w:val="13"/>
+              </w:rPr>
+            </w:pPr>
+            <w:r>
+              <w:rPr>
+                <w:rFonts w:hint="eastAsia"/>
+                <w:sz w:val="13"/>
+                <w:szCs w:val="13"/>
+              </w:rPr>
+              <w:t>布尔型</w:t>
+            </w:r>
+          </w:p>
+        </w:tc>
+        <w:tc>
+          <w:tcPr>
+            <w:tcW w:w="0" w:type="auto"/>
+          </w:tcPr>
+          <w:p>
+            <w:pPr>
+              <w:ind w:left="0"/>
+              <w:rPr>
+                <w:sz w:val="13"/>
+                <w:szCs w:val="13"/>
+              </w:rPr>
+            </w:pPr>
+            <w:r>
+              <w:rPr>
+                <w:rFonts w:hint="eastAsia"/>
+                <w:sz w:val="13"/>
+                <w:szCs w:val="13"/>
+              </w:rPr>
+              <w:t>匹配符是否支持模糊匹配</w:t>
+            </w:r>
+          </w:p>
+        </w:tc>
+      </w:tr>
+      <w:tr>
+        <w:tc>
+          <w:tcPr>
+            <w:tcW w:w="0" w:type="auto"/>
+          </w:tcPr>
+          <w:p>
+            <w:pPr>
+              <w:ind w:left="0"/>
+              <w:rPr>
+                <w:sz w:val="13"/>
+                <w:szCs w:val="13"/>
+              </w:rPr>
+            </w:pPr>
+            <w:r>
+              <w:rPr>
+                <w:rFonts w:hint="eastAsia"/>
+                <w:sz w:val="13"/>
+                <w:szCs w:val="13"/>
+              </w:rPr>
               <w:t>Detail.PlanPath</w:t>
             </w:r>
           </w:p>
@@ -3690,6 +3539,286 @@
                 <w:szCs w:val="13"/>
               </w:rPr>
               <w:t>查询计划的具体执行操作</w:t>
+            </w:r>
+          </w:p>
+        </w:tc>
+      </w:tr>
+    </w:tbl>
+    <w:p>
+      <w:pPr>
+        <w:rPr>
+          <w:rFonts w:hint="eastAsia"/>
+        </w:rPr>
+      </w:pPr>
+    </w:p>
+    <w:p>
+      <w:pPr>
+        <w:rPr>
+          <w:rFonts w:hint="eastAsia"/>
+        </w:rPr>
+      </w:pPr>
+      <w:r>
+        <w:rPr>
+          <w:rFonts w:hint="eastAsia"/>
+        </w:rPr>
+        <w:t>PlanPath</w:t>
+      </w:r>
+      <w:r>
+        <w:rPr>
+          <w:rFonts w:hint="eastAsia"/>
+        </w:rPr>
+        <w:t>的子操作：</w:t>
+      </w:r>
+    </w:p>
+    <w:tbl>
+      <w:tblPr>
+        <w:tblStyle w:val="TableGrid"/>
+        <w:tblW w:w="0" w:type="auto"/>
+        <w:tblInd w:w="357" w:type="dxa"/>
+        <w:tblLook w:val="04A0"/>
+      </w:tblPr>
+      <w:tblGrid>
+        <w:gridCol w:w="8165"/>
+      </w:tblGrid>
+      <w:tr>
+        <w:tc>
+          <w:tcPr>
+            <w:tcW w:w="8522" w:type="dxa"/>
+          </w:tcPr>
+          <w:p>
+            <w:pPr>
+              <w:ind w:left="0"/>
+              <w:rPr>
+                <w:rFonts w:hint="eastAsia"/>
+              </w:rPr>
+            </w:pPr>
+            <w:r>
+              <w:rPr>
+                <w:rFonts w:hint="eastAsia"/>
+              </w:rPr>
+              <w:t>Detail :</w:t>
+            </w:r>
+          </w:p>
+          <w:p>
+            <w:pPr>
+              <w:ind w:left="0"/>
+              <w:rPr>
+                <w:rFonts w:hint="eastAsia"/>
+              </w:rPr>
+            </w:pPr>
+            <w:r>
+              <w:rPr>
+                <w:rFonts w:hint="eastAsia"/>
+              </w:rPr>
+              <w:t>{</w:t>
+            </w:r>
+          </w:p>
+          <w:p>
+            <w:pPr>
+              <w:ind w:left="0"/>
+              <w:rPr>
+                <w:rFonts w:hint="eastAsia"/>
+              </w:rPr>
+            </w:pPr>
+            <w:r>
+              <w:rPr>
+                <w:rFonts w:hint="eastAsia"/>
+              </w:rPr>
+              <w:t xml:space="preserve">   ...,</w:t>
+            </w:r>
+          </w:p>
+          <w:p>
+            <w:pPr>
+              <w:ind w:left="0"/>
+              <w:rPr>
+                <w:rFonts w:hint="eastAsia"/>
+              </w:rPr>
+            </w:pPr>
+            <w:r>
+              <w:rPr>
+                <w:rFonts w:hint="eastAsia"/>
+              </w:rPr>
+              <w:t xml:space="preserve">   PlanPath :</w:t>
+            </w:r>
+          </w:p>
+          <w:p>
+            <w:pPr>
+              <w:ind w:left="0"/>
+              <w:rPr>
+                <w:rFonts w:hint="eastAsia"/>
+              </w:rPr>
+            </w:pPr>
+            <w:r>
+              <w:rPr>
+                <w:rFonts w:hint="eastAsia"/>
+              </w:rPr>
+              <w:t xml:space="preserve">   {</w:t>
+            </w:r>
+          </w:p>
+          <w:p>
+            <w:pPr>
+              <w:ind w:left="0"/>
+              <w:rPr>
+                <w:rFonts w:hint="eastAsia"/>
+              </w:rPr>
+            </w:pPr>
+            <w:r>
+              <w:rPr>
+                <w:rFonts w:hint="eastAsia"/>
+              </w:rPr>
+              <w:t xml:space="preserve">      Operator : 'xxx',</w:t>
+            </w:r>
+          </w:p>
+          <w:p>
+            <w:pPr>
+              <w:ind w:left="0"/>
+              <w:rPr>
+                <w:rFonts w:hint="eastAsia"/>
+              </w:rPr>
+            </w:pPr>
+            <w:r>
+              <w:rPr>
+                <w:rFonts w:hint="eastAsia"/>
+              </w:rPr>
+              <w:t xml:space="preserve">      ...,</w:t>
+            </w:r>
+          </w:p>
+          <w:p>
+            <w:pPr>
+              <w:ind w:left="0"/>
+              <w:rPr>
+                <w:rFonts w:hint="eastAsia"/>
+              </w:rPr>
+            </w:pPr>
+            <w:r>
+              <w:rPr>
+                <w:rFonts w:hint="eastAsia"/>
+              </w:rPr>
+              <w:t xml:space="preserve">      ChildOperators :</w:t>
+            </w:r>
+          </w:p>
+          <w:p>
+            <w:pPr>
+              <w:ind w:left="0"/>
+              <w:rPr>
+                <w:rFonts w:hint="eastAsia"/>
+              </w:rPr>
+            </w:pPr>
+            <w:r>
+              <w:rPr>
+                <w:rFonts w:hint="eastAsia"/>
+              </w:rPr>
+              <w:t xml:space="preserve">      [</w:t>
+            </w:r>
+          </w:p>
+          <w:p>
+            <w:pPr>
+              <w:ind w:left="0"/>
+              <w:rPr>
+                <w:rFonts w:hint="eastAsia"/>
+              </w:rPr>
+            </w:pPr>
+            <w:r>
+              <w:rPr>
+                <w:rFonts w:hint="eastAsia"/>
+              </w:rPr>
+              <w:t xml:space="preserve">         {</w:t>
+            </w:r>
+          </w:p>
+          <w:p>
+            <w:pPr>
+              <w:ind w:left="0"/>
+              <w:rPr>
+                <w:rFonts w:hint="eastAsia"/>
+              </w:rPr>
+            </w:pPr>
+            <w:r>
+              <w:rPr>
+                <w:rFonts w:hint="eastAsia"/>
+              </w:rPr>
+              <w:t xml:space="preserve">            Operator: 'xxx',</w:t>
+            </w:r>
+          </w:p>
+          <w:p>
+            <w:pPr>
+              <w:ind w:left="0"/>
+              <w:rPr>
+                <w:rFonts w:hint="eastAsia"/>
+              </w:rPr>
+            </w:pPr>
+            <w:r>
+              <w:rPr>
+                <w:rFonts w:hint="eastAsia"/>
+              </w:rPr>
+              <w:t xml:space="preserve">            ...</w:t>
+            </w:r>
+          </w:p>
+          <w:p>
+            <w:pPr>
+              <w:ind w:left="0"/>
+              <w:rPr>
+                <w:rFonts w:hint="eastAsia"/>
+              </w:rPr>
+            </w:pPr>
+            <w:r>
+              <w:rPr>
+                <w:rFonts w:hint="eastAsia"/>
+              </w:rPr>
+              <w:t xml:space="preserve">         },</w:t>
+            </w:r>
+          </w:p>
+          <w:p>
+            <w:pPr>
+              <w:ind w:left="0"/>
+              <w:rPr>
+                <w:rFonts w:hint="eastAsia"/>
+              </w:rPr>
+            </w:pPr>
+            <w:r>
+              <w:rPr>
+                <w:rFonts w:hint="eastAsia"/>
+              </w:rPr>
+              <w:t xml:space="preserve">         ...</w:t>
+            </w:r>
+          </w:p>
+          <w:p>
+            <w:pPr>
+              <w:ind w:left="0"/>
+              <w:rPr>
+                <w:rFonts w:hint="eastAsia"/>
+              </w:rPr>
+            </w:pPr>
+            <w:r>
+              <w:rPr>
+                <w:rFonts w:hint="eastAsia"/>
+              </w:rPr>
+              <w:t xml:space="preserve">      ]</w:t>
+            </w:r>
+          </w:p>
+          <w:p>
+            <w:pPr>
+              <w:ind w:left="0"/>
+              <w:rPr>
+                <w:rFonts w:hint="eastAsia"/>
+              </w:rPr>
+            </w:pPr>
+            <w:r>
+              <w:rPr>
+                <w:rFonts w:hint="eastAsia"/>
+              </w:rPr>
+              <w:t xml:space="preserve">   }</w:t>
+            </w:r>
+          </w:p>
+          <w:p>
+            <w:pPr>
+              <w:ind w:left="0"/>
+            </w:pPr>
+            <w:r>
+              <w:rPr>
+                <w:rFonts w:hint="eastAsia"/>
+              </w:rPr>
+              <w:lastRenderedPageBreak/>
+              <w:t>}</w:t>
             </w:r>
           </w:p>
         </w:tc>
@@ -4859,6 +4988,14 @@
               </w:rPr>
               <w:t>的启动时间</w:t>
             </w:r>
+            <w:r>
+              <w:rPr>
+                <w:rFonts w:hint="eastAsia"/>
+                <w:sz w:val="13"/>
+                <w:szCs w:val="13"/>
+              </w:rPr>
+              <w:t>（单位：秒）</w:t>
+            </w:r>
           </w:p>
         </w:tc>
       </w:tr>
@@ -4943,6 +5080,14 @@
               </w:rPr>
               <w:t>的运行时间</w:t>
             </w:r>
+            <w:r>
+              <w:rPr>
+                <w:rFonts w:hint="eastAsia"/>
+                <w:sz w:val="13"/>
+                <w:szCs w:val="13"/>
+              </w:rPr>
+              <w:t>（单位：秒）</w:t>
+            </w:r>
           </w:p>
         </w:tc>
       </w:tr>
@@ -5027,6 +5172,14 @@
               </w:rPr>
               <w:t>的结束时间</w:t>
             </w:r>
+            <w:r>
+              <w:rPr>
+                <w:rFonts w:hint="eastAsia"/>
+                <w:sz w:val="13"/>
+                <w:szCs w:val="13"/>
+              </w:rPr>
+              <w:t>（单位：秒）</w:t>
+            </w:r>
           </w:p>
         </w:tc>
       </w:tr>
@@ -5049,7 +5202,6 @@
                 <w:sz w:val="13"/>
                 <w:szCs w:val="13"/>
               </w:rPr>
-              <w:lastRenderedPageBreak/>
               <w:t>Estimate.MthSelectivity</w:t>
             </w:r>
           </w:p>
@@ -6650,6 +6802,7 @@
                 <w:sz w:val="13"/>
                 <w:szCs w:val="13"/>
               </w:rPr>
+              <w:lastRenderedPageBreak/>
               <w:t>Output.Sorted</w:t>
             </w:r>
           </w:p>
@@ -6912,6 +7065,14 @@
               </w:rPr>
               <w:t>的启动时间</w:t>
             </w:r>
+            <w:r>
+              <w:rPr>
+                <w:rFonts w:hint="eastAsia"/>
+                <w:sz w:val="13"/>
+                <w:szCs w:val="13"/>
+              </w:rPr>
+              <w:t>（单位：秒）</w:t>
+            </w:r>
           </w:p>
         </w:tc>
       </w:tr>
@@ -7004,6 +7165,14 @@
               </w:rPr>
               <w:t>的运行时间</w:t>
             </w:r>
+            <w:r>
+              <w:rPr>
+                <w:rFonts w:hint="eastAsia"/>
+                <w:sz w:val="13"/>
+                <w:szCs w:val="13"/>
+              </w:rPr>
+              <w:t>（单位：秒）</w:t>
+            </w:r>
           </w:p>
         </w:tc>
       </w:tr>
@@ -7096,6 +7265,14 @@
               </w:rPr>
               <w:t>的结束时间</w:t>
             </w:r>
+            <w:r>
+              <w:rPr>
+                <w:rFonts w:hint="eastAsia"/>
+                <w:sz w:val="13"/>
+                <w:szCs w:val="13"/>
+              </w:rPr>
+              <w:t>（单位：秒）</w:t>
+            </w:r>
           </w:p>
         </w:tc>
       </w:tr>
@@ -7684,7 +7861,7 @@
                 <w:sz w:val="13"/>
                 <w:szCs w:val="13"/>
               </w:rPr>
-              <w:t>是否视同</w:t>
+              <w:t>是否使用</w:t>
             </w:r>
             <w:r>
               <w:rPr>
@@ -7834,7 +8011,7 @@
       <w:tblGrid>
         <w:gridCol w:w="1197"/>
         <w:gridCol w:w="809"/>
-        <w:gridCol w:w="2250"/>
+        <w:gridCol w:w="2442"/>
       </w:tblGrid>
       <w:tr>
         <w:tc>
@@ -8093,7 +8270,6 @@
                 <w:sz w:val="13"/>
                 <w:szCs w:val="13"/>
               </w:rPr>
-              <w:lastRenderedPageBreak/>
               <w:t>"</w:t>
             </w:r>
             <w:r>
@@ -8157,7 +8333,6 @@
                 <w:sz w:val="13"/>
                 <w:szCs w:val="13"/>
               </w:rPr>
-              <w:lastRenderedPageBreak/>
               <w:t>Output</w:t>
             </w:r>
           </w:p>
@@ -8672,6 +8847,14 @@
               </w:rPr>
               <w:t>的启动时间</w:t>
             </w:r>
+            <w:r>
+              <w:rPr>
+                <w:rFonts w:hint="eastAsia"/>
+                <w:sz w:val="13"/>
+                <w:szCs w:val="13"/>
+              </w:rPr>
+              <w:t>（单位：秒）</w:t>
+            </w:r>
           </w:p>
         </w:tc>
       </w:tr>
@@ -8756,6 +8939,14 @@
               </w:rPr>
               <w:t>的运行时间</w:t>
             </w:r>
+            <w:r>
+              <w:rPr>
+                <w:rFonts w:hint="eastAsia"/>
+                <w:sz w:val="13"/>
+                <w:szCs w:val="13"/>
+              </w:rPr>
+              <w:t>（单位：秒）</w:t>
+            </w:r>
           </w:p>
         </w:tc>
       </w:tr>
@@ -8840,6 +9031,14 @@
               </w:rPr>
               <w:t>的结束时间</w:t>
             </w:r>
+            <w:r>
+              <w:rPr>
+                <w:rFonts w:hint="eastAsia"/>
+                <w:sz w:val="13"/>
+                <w:szCs w:val="13"/>
+              </w:rPr>
+              <w:t>（单位：秒）</w:t>
+            </w:r>
           </w:p>
         </w:tc>
       </w:tr>
@@ -8915,6 +9114,46 @@
                 <w:szCs w:val="13"/>
               </w:rPr>
               <w:t>的子操作</w:t>
+            </w:r>
+            <w:r>
+              <w:rPr>
+                <w:rFonts w:hint="eastAsia"/>
+                <w:sz w:val="13"/>
+                <w:szCs w:val="13"/>
+              </w:rPr>
+              <w:t>（</w:t>
+            </w:r>
+            <w:r>
+              <w:rPr>
+                <w:rFonts w:hint="eastAsia"/>
+                <w:sz w:val="13"/>
+                <w:szCs w:val="13"/>
+              </w:rPr>
+              <w:t>TBSCAN</w:t>
+            </w:r>
+            <w:r>
+              <w:rPr>
+                <w:rFonts w:hint="eastAsia"/>
+                <w:sz w:val="13"/>
+                <w:szCs w:val="13"/>
+              </w:rPr>
+              <w:t>或者</w:t>
+            </w:r>
+            <w:r>
+              <w:rPr>
+                <w:rFonts w:hint="eastAsia"/>
+                <w:sz w:val="13"/>
+                <w:szCs w:val="13"/>
+              </w:rPr>
+              <w:t>IXSCAN</w:t>
+            </w:r>
+            <w:r>
+              <w:rPr>
+                <w:rFonts w:hint="eastAsia"/>
+                <w:sz w:val="13"/>
+                <w:szCs w:val="13"/>
+              </w:rPr>
+              <w:t>）</w:t>
             </w:r>
           </w:p>
         </w:tc>
@@ -9016,6 +9255,7 @@
               <w:ind w:left="0"/>
             </w:pPr>
             <w:r>
+              <w:lastRenderedPageBreak/>
               <w:t xml:space="preserve">      {</w:t>
             </w:r>
           </w:p>
@@ -9184,16 +9424,312 @@
               <w:ind w:left="0"/>
             </w:pPr>
             <w:r>
+              <w:t xml:space="preserve">          }</w:t>
+            </w:r>
+          </w:p>
+          <w:p>
+            <w:pPr>
+              <w:ind w:left="0"/>
+            </w:pPr>
+            <w:r>
+              <w:t xml:space="preserve">        }</w:t>
+            </w:r>
+          </w:p>
+          <w:p>
+            <w:pPr>
+              <w:ind w:left="0"/>
+            </w:pPr>
+            <w:r>
+              <w:t xml:space="preserve">      ]</w:t>
+            </w:r>
+          </w:p>
+          <w:p>
+            <w:pPr>
+              <w:ind w:left="0"/>
+            </w:pPr>
+            <w:r>
+              <w:t xml:space="preserve">    },</w:t>
+            </w:r>
+          </w:p>
+          <w:p>
+            <w:pPr>
+              <w:ind w:left="0"/>
+            </w:pPr>
+            <w:r>
+              <w:t xml:space="preserve">    "OrderBy": {},</w:t>
+            </w:r>
+          </w:p>
+          <w:p>
+            <w:pPr>
+              <w:ind w:left="0"/>
+            </w:pPr>
+            <w:r>
+              <w:t xml:space="preserve">    "Hint": {},</w:t>
+            </w:r>
+          </w:p>
+          <w:p>
+            <w:pPr>
+              <w:ind w:left="0"/>
+            </w:pPr>
+            <w:r>
+              <w:t xml:space="preserve">    "Flags": 0,</w:t>
+            </w:r>
+          </w:p>
+          <w:p>
+            <w:pPr>
+              <w:ind w:left="0"/>
+            </w:pPr>
+            <w:r>
+              <w:t xml:space="preserve">    "MatchConfig": {</w:t>
+            </w:r>
+          </w:p>
+          <w:p>
+            <w:pPr>
+              <w:ind w:left="0"/>
+            </w:pPr>
+            <w:r>
+              <w:t xml:space="preserve">      "EnableMixCmp": false,</w:t>
+            </w:r>
+          </w:p>
+          <w:p>
+            <w:pPr>
+              <w:ind w:left="0"/>
+            </w:pPr>
+            <w:r>
+              <w:t xml:space="preserve">      "Parameterized": true,</w:t>
+            </w:r>
+          </w:p>
+          <w:p>
+            <w:pPr>
+              <w:ind w:left="0"/>
+            </w:pPr>
+            <w:r>
+              <w:t xml:space="preserve">      "FuzzyOptr": false</w:t>
+            </w:r>
+          </w:p>
+          <w:p>
+            <w:pPr>
+              <w:ind w:left="0"/>
+            </w:pPr>
+            <w:r>
+              <w:t xml:space="preserve">    },</w:t>
+            </w:r>
+          </w:p>
+          <w:p>
+            <w:pPr>
+              <w:ind w:left="0"/>
+            </w:pPr>
+            <w:r>
+              <w:t xml:space="preserve">    "ParamValid": false,</w:t>
+            </w:r>
+          </w:p>
+          <w:p>
+            <w:pPr>
+              <w:ind w:left="0"/>
+            </w:pPr>
+            <w:r>
+              <w:t xml:space="preserve">    "PlanPath": {</w:t>
+            </w:r>
+          </w:p>
+          <w:p>
+            <w:pPr>
+              <w:ind w:left="0"/>
+            </w:pPr>
+            <w:r>
+              <w:t xml:space="preserve">      "Operator": "TBSCAN",</w:t>
+            </w:r>
+          </w:p>
+          <w:p>
+            <w:pPr>
+              <w:ind w:left="0"/>
+            </w:pPr>
+            <w:r>
+              <w:t xml:space="preserve">      "Collection": "newcs.newcl",</w:t>
+            </w:r>
+          </w:p>
+          <w:p>
+            <w:pPr>
+              <w:ind w:left="0"/>
+            </w:pPr>
+            <w:r>
+              <w:t xml:space="preserve">      "Input": {</w:t>
+            </w:r>
+          </w:p>
+          <w:p>
+            <w:pPr>
+              <w:ind w:left="0"/>
+            </w:pPr>
+            <w:r>
+              <w:t xml:space="preserve">        "Pages": 1,</w:t>
+            </w:r>
+          </w:p>
+          <w:p>
+            <w:pPr>
+              <w:ind w:left="0"/>
+            </w:pPr>
+            <w:r>
+              <w:t xml:space="preserve">        "Records": 10,</w:t>
+            </w:r>
+          </w:p>
+          <w:p>
+            <w:pPr>
+              <w:ind w:left="0"/>
+            </w:pPr>
+            <w:r>
+              <w:t xml:space="preserve">        "RecordSize": 1</w:t>
+            </w:r>
+          </w:p>
+          <w:p>
+            <w:pPr>
+              <w:ind w:left="0"/>
+            </w:pPr>
+            <w:r>
+              <w:t xml:space="preserve">      },</w:t>
+            </w:r>
+          </w:p>
+          <w:p>
+            <w:pPr>
+              <w:ind w:left="0"/>
+            </w:pPr>
+            <w:r>
+              <w:t xml:space="preserve">      "Output": {</w:t>
+            </w:r>
+          </w:p>
+          <w:p>
+            <w:pPr>
+              <w:ind w:left="0"/>
+            </w:pPr>
+            <w:r>
+              <w:t xml:space="preserve">        "Records": 1,</w:t>
+            </w:r>
+          </w:p>
+          <w:p>
+            <w:pPr>
+              <w:ind w:left="0"/>
+            </w:pPr>
+            <w:r>
               <w:lastRenderedPageBreak/>
-              <w:t xml:space="preserve">          }</w:t>
-            </w:r>
-          </w:p>
-          <w:p>
-            <w:pPr>
-              <w:ind w:left="0"/>
-            </w:pPr>
-            <w:r>
-              <w:t xml:space="preserve">        }</w:t>
+              <w:t xml:space="preserve">        "RecordSize": 1,</w:t>
+            </w:r>
+          </w:p>
+          <w:p>
+            <w:pPr>
+              <w:ind w:left="0"/>
+            </w:pPr>
+            <w:r>
+              <w:t xml:space="preserve">        "Sorted": 0</w:t>
+            </w:r>
+          </w:p>
+          <w:p>
+            <w:pPr>
+              <w:ind w:left="0"/>
+            </w:pPr>
+            <w:r>
+              <w:t xml:space="preserve">      },</w:t>
+            </w:r>
+          </w:p>
+          <w:p>
+            <w:pPr>
+              <w:ind w:left="0"/>
+            </w:pPr>
+            <w:r>
+              <w:t xml:space="preserve">      "Estimate": {</w:t>
+            </w:r>
+          </w:p>
+          <w:p>
+            <w:pPr>
+              <w:ind w:left="0"/>
+            </w:pPr>
+            <w:r>
+              <w:t xml:space="preserve">        "StartCost": 0,</w:t>
+            </w:r>
+          </w:p>
+          <w:p>
+            <w:pPr>
+              <w:ind w:left="0"/>
+            </w:pPr>
+            <w:r>
+              <w:t xml:space="preserve">        "RunCost": 0.03,</w:t>
+            </w:r>
+          </w:p>
+          <w:p>
+            <w:pPr>
+              <w:ind w:left="0"/>
+            </w:pPr>
+            <w:r>
+              <w:t xml:space="preserve">        "TotalCost": 0.03</w:t>
+            </w:r>
+          </w:p>
+          <w:p>
+            <w:pPr>
+              <w:ind w:left="0"/>
+            </w:pPr>
+            <w:r>
+              <w:t xml:space="preserve">      },</w:t>
+            </w:r>
+          </w:p>
+          <w:p>
+            <w:pPr>
+              <w:ind w:left="0"/>
+            </w:pPr>
+            <w:r>
+              <w:t xml:space="preserve">      "CLEstFromStat": false,</w:t>
+            </w:r>
+          </w:p>
+          <w:p>
+            <w:pPr>
+              <w:ind w:left="0"/>
+            </w:pPr>
+            <w:r>
+              <w:t xml:space="preserve">      "CLStatTime": {</w:t>
+            </w:r>
+          </w:p>
+          <w:p>
+            <w:pPr>
+              <w:ind w:left="0"/>
+            </w:pPr>
+            <w:r>
+              <w:t xml:space="preserve">        "$timestamp": "1970-01-01-08.00.00.000000"</w:t>
+            </w:r>
+          </w:p>
+          <w:p>
+            <w:pPr>
+              <w:ind w:left="0"/>
+            </w:pPr>
+            <w:r>
+              <w:t xml:space="preserve">      }</w:t>
+            </w:r>
+          </w:p>
+          <w:p>
+            <w:pPr>
+              <w:ind w:left="0"/>
+            </w:pPr>
+            <w:r>
+              <w:t xml:space="preserve">    },</w:t>
+            </w:r>
+          </w:p>
+          <w:p>
+            <w:pPr>
+              <w:ind w:left="0"/>
+            </w:pPr>
+            <w:r>
+              <w:t xml:space="preserve">    "Parameters": {</w:t>
+            </w:r>
+          </w:p>
+          <w:p>
+            <w:pPr>
+              <w:ind w:left="0"/>
+            </w:pPr>
+            <w:r>
+              <w:t xml:space="preserve">      "$param": [</w:t>
+            </w:r>
+          </w:p>
+          <w:p>
+            <w:pPr>
+              <w:ind w:left="0"/>
+            </w:pPr>
+            <w:r>
+              <w:t xml:space="preserve">        1</w:t>
             </w:r>
           </w:p>
           <w:p>
@@ -9209,302 +9745,6 @@
               <w:ind w:left="0"/>
             </w:pPr>
             <w:r>
-              <w:t xml:space="preserve">    },</w:t>
-            </w:r>
-          </w:p>
-          <w:p>
-            <w:pPr>
-              <w:ind w:left="0"/>
-            </w:pPr>
-            <w:r>
-              <w:t xml:space="preserve">    "OrderBy": {},</w:t>
-            </w:r>
-          </w:p>
-          <w:p>
-            <w:pPr>
-              <w:ind w:left="0"/>
-            </w:pPr>
-            <w:r>
-              <w:t xml:space="preserve">    "Hint": {},</w:t>
-            </w:r>
-          </w:p>
-          <w:p>
-            <w:pPr>
-              <w:ind w:left="0"/>
-            </w:pPr>
-            <w:r>
-              <w:t xml:space="preserve">    "Flags": 0,</w:t>
-            </w:r>
-          </w:p>
-          <w:p>
-            <w:pPr>
-              <w:ind w:left="0"/>
-            </w:pPr>
-            <w:r>
-              <w:t xml:space="preserve">    "MatchConfig": {</w:t>
-            </w:r>
-          </w:p>
-          <w:p>
-            <w:pPr>
-              <w:ind w:left="0"/>
-            </w:pPr>
-            <w:r>
-              <w:t xml:space="preserve">      "EnableMixCmp": false,</w:t>
-            </w:r>
-          </w:p>
-          <w:p>
-            <w:pPr>
-              <w:ind w:left="0"/>
-            </w:pPr>
-            <w:r>
-              <w:t xml:space="preserve">      "Parameterized": true,</w:t>
-            </w:r>
-          </w:p>
-          <w:p>
-            <w:pPr>
-              <w:ind w:left="0"/>
-            </w:pPr>
-            <w:r>
-              <w:t xml:space="preserve">      "FuzzyOptr": false</w:t>
-            </w:r>
-          </w:p>
-          <w:p>
-            <w:pPr>
-              <w:ind w:left="0"/>
-            </w:pPr>
-            <w:r>
-              <w:t xml:space="preserve">    },</w:t>
-            </w:r>
-          </w:p>
-          <w:p>
-            <w:pPr>
-              <w:ind w:left="0"/>
-            </w:pPr>
-            <w:r>
-              <w:t xml:space="preserve">    "ParamValid": false,</w:t>
-            </w:r>
-          </w:p>
-          <w:p>
-            <w:pPr>
-              <w:ind w:left="0"/>
-            </w:pPr>
-            <w:r>
-              <w:t xml:space="preserve">    "PlanPath": {</w:t>
-            </w:r>
-          </w:p>
-          <w:p>
-            <w:pPr>
-              <w:ind w:left="0"/>
-            </w:pPr>
-            <w:r>
-              <w:t xml:space="preserve">      "Operator": "TBSCAN",</w:t>
-            </w:r>
-          </w:p>
-          <w:p>
-            <w:pPr>
-              <w:ind w:left="0"/>
-            </w:pPr>
-            <w:r>
-              <w:t xml:space="preserve">      "Collection": "newcs.newcl",</w:t>
-            </w:r>
-          </w:p>
-          <w:p>
-            <w:pPr>
-              <w:ind w:left="0"/>
-            </w:pPr>
-            <w:r>
-              <w:t xml:space="preserve">      "Input": {</w:t>
-            </w:r>
-          </w:p>
-          <w:p>
-            <w:pPr>
-              <w:ind w:left="0"/>
-            </w:pPr>
-            <w:r>
-              <w:t xml:space="preserve">        "Pages": 1,</w:t>
-            </w:r>
-          </w:p>
-          <w:p>
-            <w:pPr>
-              <w:ind w:left="0"/>
-            </w:pPr>
-            <w:r>
-              <w:t xml:space="preserve">        "Records": 10,</w:t>
-            </w:r>
-          </w:p>
-          <w:p>
-            <w:pPr>
-              <w:ind w:left="0"/>
-            </w:pPr>
-            <w:r>
-              <w:t xml:space="preserve">        "RecordSize": 1</w:t>
-            </w:r>
-          </w:p>
-          <w:p>
-            <w:pPr>
-              <w:ind w:left="0"/>
-            </w:pPr>
-            <w:r>
-              <w:t xml:space="preserve">      },</w:t>
-            </w:r>
-          </w:p>
-          <w:p>
-            <w:pPr>
-              <w:ind w:left="0"/>
-            </w:pPr>
-            <w:r>
-              <w:t xml:space="preserve">      "Output": {</w:t>
-            </w:r>
-          </w:p>
-          <w:p>
-            <w:pPr>
-              <w:ind w:left="0"/>
-            </w:pPr>
-            <w:r>
-              <w:t xml:space="preserve">        "Records": 1,</w:t>
-            </w:r>
-          </w:p>
-          <w:p>
-            <w:pPr>
-              <w:ind w:left="0"/>
-            </w:pPr>
-            <w:r>
-              <w:t xml:space="preserve">        "RecordSize": 1,</w:t>
-            </w:r>
-          </w:p>
-          <w:p>
-            <w:pPr>
-              <w:ind w:left="0"/>
-            </w:pPr>
-            <w:r>
-              <w:t xml:space="preserve">        "Sorted": 0</w:t>
-            </w:r>
-          </w:p>
-          <w:p>
-            <w:pPr>
-              <w:ind w:left="0"/>
-            </w:pPr>
-            <w:r>
-              <w:t xml:space="preserve">      },</w:t>
-            </w:r>
-          </w:p>
-          <w:p>
-            <w:pPr>
-              <w:ind w:left="0"/>
-            </w:pPr>
-            <w:r>
-              <w:t xml:space="preserve">      "Estimate": {</w:t>
-            </w:r>
-          </w:p>
-          <w:p>
-            <w:pPr>
-              <w:ind w:left="0"/>
-            </w:pPr>
-            <w:r>
-              <w:t xml:space="preserve">        "StartCost": 0,</w:t>
-            </w:r>
-          </w:p>
-          <w:p>
-            <w:pPr>
-              <w:ind w:left="0"/>
-            </w:pPr>
-            <w:r>
-              <w:t xml:space="preserve">        "RunCost": 0.03,</w:t>
-            </w:r>
-          </w:p>
-          <w:p>
-            <w:pPr>
-              <w:ind w:left="0"/>
-            </w:pPr>
-            <w:r>
-              <w:t xml:space="preserve">        "TotalCost": 0.03</w:t>
-            </w:r>
-          </w:p>
-          <w:p>
-            <w:pPr>
-              <w:ind w:left="0"/>
-            </w:pPr>
-            <w:r>
-              <w:t xml:space="preserve">      },</w:t>
-            </w:r>
-          </w:p>
-          <w:p>
-            <w:pPr>
-              <w:ind w:left="0"/>
-            </w:pPr>
-            <w:r>
-              <w:t xml:space="preserve">      "CLEstFromStat": false,</w:t>
-            </w:r>
-          </w:p>
-          <w:p>
-            <w:pPr>
-              <w:ind w:left="0"/>
-            </w:pPr>
-            <w:r>
-              <w:t xml:space="preserve">      "CLStatTime": {</w:t>
-            </w:r>
-          </w:p>
-          <w:p>
-            <w:pPr>
-              <w:ind w:left="0"/>
-            </w:pPr>
-            <w:r>
-              <w:t xml:space="preserve">        "$timestamp": "1970-01-01-08.00.00.000000"</w:t>
-            </w:r>
-          </w:p>
-          <w:p>
-            <w:pPr>
-              <w:ind w:left="0"/>
-            </w:pPr>
-            <w:r>
-              <w:t xml:space="preserve">      }</w:t>
-            </w:r>
-          </w:p>
-          <w:p>
-            <w:pPr>
-              <w:ind w:left="0"/>
-            </w:pPr>
-            <w:r>
-              <w:t xml:space="preserve">    },</w:t>
-            </w:r>
-          </w:p>
-          <w:p>
-            <w:pPr>
-              <w:ind w:left="0"/>
-            </w:pPr>
-            <w:r>
-              <w:t xml:space="preserve">    "Parameters": {</w:t>
-            </w:r>
-          </w:p>
-          <w:p>
-            <w:pPr>
-              <w:ind w:left="0"/>
-            </w:pPr>
-            <w:r>
-              <w:t xml:space="preserve">      "$param": [</w:t>
-            </w:r>
-          </w:p>
-          <w:p>
-            <w:pPr>
-              <w:ind w:left="0"/>
-            </w:pPr>
-            <w:r>
-              <w:t xml:space="preserve">        1</w:t>
-            </w:r>
-          </w:p>
-          <w:p>
-            <w:pPr>
-              <w:ind w:left="0"/>
-            </w:pPr>
-            <w:r>
-              <w:t xml:space="preserve">      ]</w:t>
-            </w:r>
-          </w:p>
-          <w:p>
-            <w:pPr>
-              <w:ind w:left="0"/>
-            </w:pPr>
-            <w:r>
               <w:t xml:space="preserve">    }</w:t>
             </w:r>
           </w:p>
@@ -9537,7 +9777,6 @@
               <w:ind w:left="0"/>
             </w:pPr>
             <w:r>
-              <w:lastRenderedPageBreak/>
               <w:t xml:space="preserve">  "IndexRead": 0,</w:t>
             </w:r>
           </w:p>
@@ -9737,6 +9976,14 @@
                 <w:szCs w:val="18"/>
               </w:rPr>
             </w:pPr>
+            <w:r>
+              <w:rPr>
+                <w:rFonts w:hint="eastAsia"/>
+                <w:sz w:val="18"/>
+                <w:szCs w:val="18"/>
+              </w:rPr>
+              <w:t>1.0</w:t>
+            </w:r>
           </w:p>
         </w:tc>
         <w:tc>
@@ -9775,6 +10022,14 @@
                 <w:szCs w:val="18"/>
               </w:rPr>
             </w:pPr>
+            <w:r>
+              <w:rPr>
+                <w:rFonts w:hint="eastAsia"/>
+                <w:sz w:val="18"/>
+                <w:szCs w:val="18"/>
+              </w:rPr>
+              <w:t>5</w:t>
+            </w:r>
           </w:p>
         </w:tc>
       </w:tr>
@@ -9815,6 +10070,14 @@
                 <w:szCs w:val="18"/>
               </w:rPr>
             </w:pPr>
+            <w:r>
+              <w:rPr>
+                <w:rFonts w:hint="eastAsia"/>
+                <w:sz w:val="18"/>
+                <w:szCs w:val="18"/>
+              </w:rPr>
+              <w:t>2017-10-10</w:t>
+            </w:r>
           </w:p>
         </w:tc>
         <w:tc>
@@ -9853,6 +10116,14 @@
                 <w:szCs w:val="18"/>
               </w:rPr>
             </w:pPr>
+            <w:r>
+              <w:rPr>
+                <w:rFonts w:hint="eastAsia"/>
+                <w:sz w:val="18"/>
+                <w:szCs w:val="18"/>
+              </w:rPr>
+              <w:t>2017-10-15</w:t>
+            </w:r>
           </w:p>
         </w:tc>
       </w:tr>
@@ -9988,6 +10259,14 @@
                 <w:szCs w:val="18"/>
               </w:rPr>
             </w:pPr>
+            <w:r>
+              <w:rPr>
+                <w:rFonts w:hint="eastAsia"/>
+                <w:sz w:val="18"/>
+                <w:szCs w:val="18"/>
+              </w:rPr>
+              <w:t>1</w:t>
+            </w:r>
           </w:p>
         </w:tc>
         <w:tc>
@@ -10003,6 +10282,14 @@
                 <w:szCs w:val="18"/>
               </w:rPr>
             </w:pPr>
+            <w:r>
+              <w:rPr>
+                <w:rFonts w:hint="eastAsia"/>
+                <w:sz w:val="18"/>
+                <w:szCs w:val="18"/>
+              </w:rPr>
+              <w:t>设计及代码修改</w:t>
+            </w:r>
           </w:p>
         </w:tc>
         <w:tc>
@@ -10018,6 +10305,47 @@
                 <w:szCs w:val="18"/>
               </w:rPr>
             </w:pPr>
+            <w:r>
+              <w:rPr>
+                <w:rFonts w:hint="eastAsia"/>
+                <w:sz w:val="18"/>
+                <w:szCs w:val="18"/>
+              </w:rPr>
+              <w:t>部分</w:t>
+            </w:r>
+            <w:r>
+              <w:rPr>
+                <w:rFonts w:hint="eastAsia"/>
+                <w:sz w:val="18"/>
+                <w:szCs w:val="18"/>
+              </w:rPr>
+              <w:t>explain</w:t>
+            </w:r>
+            <w:r>
+              <w:rPr>
+                <w:rFonts w:hint="eastAsia"/>
+                <w:sz w:val="18"/>
+                <w:szCs w:val="18"/>
+              </w:rPr>
+              <w:t>代码修改已在前面的</w:t>
+            </w:r>
+            <w:r>
+              <w:rPr>
+                <w:rFonts w:hint="eastAsia"/>
+                <w:sz w:val="18"/>
+                <w:szCs w:val="18"/>
+              </w:rPr>
+              <w:lastRenderedPageBreak/>
+              <w:t>story</w:t>
+            </w:r>
+            <w:r>
+              <w:rPr>
+                <w:rFonts w:hint="eastAsia"/>
+                <w:sz w:val="18"/>
+                <w:szCs w:val="18"/>
+              </w:rPr>
+              <w:t>中实现</w:t>
+            </w:r>
           </w:p>
         </w:tc>
       </w:tr>
@@ -10034,6 +10362,15 @@
                 <w:szCs w:val="18"/>
               </w:rPr>
             </w:pPr>
+            <w:r>
+              <w:rPr>
+                <w:rFonts w:hint="eastAsia"/>
+                <w:sz w:val="18"/>
+                <w:szCs w:val="18"/>
+              </w:rPr>
+              <w:lastRenderedPageBreak/>
+              <w:t>2</w:t>
+            </w:r>
           </w:p>
         </w:tc>
         <w:tc>
@@ -10049,6 +10386,22 @@
                 <w:szCs w:val="18"/>
               </w:rPr>
             </w:pPr>
+            <w:r>
+              <w:rPr>
+                <w:rFonts w:hint="eastAsia"/>
+                <w:sz w:val="18"/>
+                <w:szCs w:val="18"/>
+              </w:rPr>
+              <w:t>自测</w:t>
+            </w:r>
+            <w:r>
+              <w:rPr>
+                <w:rFonts w:hint="eastAsia"/>
+                <w:sz w:val="18"/>
+                <w:szCs w:val="18"/>
+              </w:rPr>
+              <w:t>及代码提交</w:t>
+            </w:r>
           </w:p>
         </w:tc>
         <w:tc>
@@ -10665,7 +11018,6 @@
                 <w:sz w:val="13"/>
                 <w:szCs w:val="13"/>
               </w:rPr>
-              <w:lastRenderedPageBreak/>
               <w:t>001</w:t>
             </w:r>
           </w:p>
@@ -11604,6 +11956,7 @@
               <w:rPr>
                 <w:rFonts w:hint="eastAsia"/>
               </w:rPr>
+              <w:lastRenderedPageBreak/>
               <w:t>周边关联产品或模块是否通知</w:t>
             </w:r>
           </w:p>

</xml_diff>